<commit_message>
update for the new features
</commit_message>
<xml_diff>
--- a/django_hr/documents/templates/BASE_ATTESTATION.docx
+++ b/django_hr/documents/templates/BASE_ATTESTATION.docx
@@ -746,38 +746,6 @@
         </w:rPr>
         <w:t>La Directrice des Ressources Humaines</w:t>
       </w:r>
-    </w:p>
-    <w:p>
-      <w:pPr>
-        <w:ind w:left="4248" w:firstLine="708"/>
-        <w:rPr>
-          <w:b/>
-        </w:rPr>
-      </w:pPr>
-    </w:p>
-    <w:p>
-      <w:pPr>
-        <w:ind w:left="4248" w:firstLine="708"/>
-        <w:rPr>
-          <w:b/>
-        </w:rPr>
-      </w:pPr>
-    </w:p>
-    <w:p>
-      <w:pPr>
-        <w:ind w:left="4248" w:firstLine="708"/>
-        <w:rPr>
-          <w:b/>
-        </w:rPr>
-      </w:pPr>
-    </w:p>
-    <w:p>
-      <w:pPr>
-        <w:ind w:left="4248" w:firstLine="708"/>
-        <w:rPr>
-          <w:b/>
-        </w:rPr>
-      </w:pPr>
     </w:p>
     <w:p>
       <w:pPr>

</xml_diff>

<commit_message>
sync: production code from 210 as source of truth
</commit_message>
<xml_diff>
--- a/django_hr/documents/templates/BASE_ATTESTATION.docx
+++ b/django_hr/documents/templates/BASE_ATTESTATION.docx
@@ -1,6 +1,6 @@
 
 <file path=word/document.xml><?xml version="1.0" encoding="utf-8"?>
-<w:document xmlns:wpc="http://schemas.microsoft.com/office/word/2010/wordprocessingCanvas" xmlns:cx="http://schemas.microsoft.com/office/drawing/2014/chartex" xmlns:cx1="http://schemas.microsoft.com/office/drawing/2015/9/8/chartex" xmlns:cx2="http://schemas.microsoft.com/office/drawing/2015/10/21/chartex" xmlns:cx3="http://schemas.microsoft.com/office/drawing/2016/5/9/chartex" xmlns:cx4="http://schemas.microsoft.com/office/drawing/2016/5/10/chartex" xmlns:cx5="http://schemas.microsoft.com/office/drawing/2016/5/11/chartex" xmlns:cx6="http://schemas.microsoft.com/office/drawing/2016/5/12/chartex" xmlns:cx7="http://schemas.microsoft.com/office/drawing/2016/5/13/chartex" xmlns:cx8="http://schemas.microsoft.com/office/drawing/2016/5/14/chartex" xmlns:mc="http://schemas.openxmlformats.org/markup-compatibility/2006" xmlns:aink="http://schemas.microsoft.com/office/drawing/2016/ink" xmlns:am3d="http://schemas.microsoft.com/office/drawing/2017/model3d" xmlns:o="urn:schemas-microsoft-com:office:office" xmlns:r="http://schemas.openxmlformats.org/officeDocument/2006/relationships" xmlns:m="http://schemas.openxmlformats.org/officeDocument/2006/math" xmlns:v="urn:schemas-microsoft-com:vml" xmlns:wp14="http://schemas.microsoft.com/office/word/2010/wordprocessingDrawing" xmlns:wp="http://schemas.openxmlformats.org/drawingml/2006/wordprocessingDrawing" xmlns:w10="urn:schemas-microsoft-com:office:word" xmlns:w="http://schemas.openxmlformats.org/wordprocessingml/2006/main" xmlns:w14="http://schemas.microsoft.com/office/word/2010/wordml" xmlns:w15="http://schemas.microsoft.com/office/word/2012/wordml" xmlns:w16cex="http://schemas.microsoft.com/office/word/2018/wordml/cex" xmlns:w16cid="http://schemas.microsoft.com/office/word/2016/wordml/cid" xmlns:w16="http://schemas.microsoft.com/office/word/2018/wordml" xmlns:w16sdtdh="http://schemas.microsoft.com/office/word/2020/wordml/sdtdatahash" xmlns:w16se="http://schemas.microsoft.com/office/word/2015/wordml/symex" xmlns:wpg="http://schemas.microsoft.com/office/word/2010/wordprocessingGroup" xmlns:wpi="http://schemas.microsoft.com/office/word/2010/wordprocessingInk" xmlns:wne="http://schemas.microsoft.com/office/word/2006/wordml" xmlns:wps="http://schemas.microsoft.com/office/word/2010/wordprocessingShape" mc:Ignorable="w14 w15 w16se w16cid w16 w16cex w16sdtdh wp14">
+<w:document xmlns:wpc="http://schemas.microsoft.com/office/word/2010/wordprocessingCanvas" xmlns:cx="http://schemas.microsoft.com/office/drawing/2014/chartex" xmlns:cx1="http://schemas.microsoft.com/office/drawing/2015/9/8/chartex" xmlns:cx2="http://schemas.microsoft.com/office/drawing/2015/10/21/chartex" xmlns:cx3="http://schemas.microsoft.com/office/drawing/2016/5/9/chartex" xmlns:cx4="http://schemas.microsoft.com/office/drawing/2016/5/10/chartex" xmlns:cx5="http://schemas.microsoft.com/office/drawing/2016/5/11/chartex" xmlns:cx6="http://schemas.microsoft.com/office/drawing/2016/5/12/chartex" xmlns:cx7="http://schemas.microsoft.com/office/drawing/2016/5/13/chartex" xmlns:cx8="http://schemas.microsoft.com/office/drawing/2016/5/14/chartex" xmlns:mc="http://schemas.openxmlformats.org/markup-compatibility/2006" xmlns:aink="http://schemas.microsoft.com/office/drawing/2016/ink" xmlns:am3d="http://schemas.microsoft.com/office/drawing/2017/model3d" xmlns:o="urn:schemas-microsoft-com:office:office" xmlns:oel="http://schemas.microsoft.com/office/2019/extlst" xmlns:r="http://schemas.openxmlformats.org/officeDocument/2006/relationships" xmlns:m="http://schemas.openxmlformats.org/officeDocument/2006/math" xmlns:v="urn:schemas-microsoft-com:vml" xmlns:wp14="http://schemas.microsoft.com/office/word/2010/wordprocessingDrawing" xmlns:wp="http://schemas.openxmlformats.org/drawingml/2006/wordprocessingDrawing" xmlns:w10="urn:schemas-microsoft-com:office:word" xmlns:w="http://schemas.openxmlformats.org/wordprocessingml/2006/main" xmlns:w14="http://schemas.microsoft.com/office/word/2010/wordml" xmlns:w15="http://schemas.microsoft.com/office/word/2012/wordml" xmlns:w16cex="http://schemas.microsoft.com/office/word/2018/wordml/cex" xmlns:w16cid="http://schemas.microsoft.com/office/word/2016/wordml/cid" xmlns:w16="http://schemas.microsoft.com/office/word/2018/wordml" xmlns:w16du="http://schemas.microsoft.com/office/word/2023/wordml/word16du" xmlns:w16sdtdh="http://schemas.microsoft.com/office/word/2020/wordml/sdtdatahash" xmlns:w16sdtfl="http://schemas.microsoft.com/office/word/2024/wordml/sdtformatlock" xmlns:w16se="http://schemas.microsoft.com/office/word/2015/wordml/symex" xmlns:wpg="http://schemas.microsoft.com/office/word/2010/wordprocessingGroup" xmlns:wpi="http://schemas.microsoft.com/office/word/2010/wordprocessingInk" xmlns:wne="http://schemas.microsoft.com/office/word/2006/wordml" xmlns:wps="http://schemas.microsoft.com/office/word/2010/wordprocessingShape" mc:Ignorable="w14 w15 w16se w16cid w16 w16cex w16sdtdh w16sdtfl w16du wp14">
   <w:body>
     <w:p>
       <w:pPr>
@@ -619,7 +619,15 @@
           <w:b/>
           <w:bCs/>
         </w:rPr>
-        <w:t>Date d’</w:t>
+        <w:t xml:space="preserve">Date </w:t>
+      </w:r>
+      <w:proofErr w:type="gramStart"/>
+      <w:r>
+        <w:rPr>
+          <w:b/>
+          <w:bCs/>
+        </w:rPr>
+        <w:t>d’</w:t>
       </w:r>
       <w:proofErr w:type="spellStart"/>
       <w:r>
@@ -641,7 +649,14 @@
         <w:rPr>
           <w:b/>
         </w:rPr>
-        <w:t xml:space="preserve">, </w:t>
+        <w:t>,</w:t>
+      </w:r>
+      <w:proofErr w:type="gramEnd"/>
+      <w:r>
+        <w:rPr>
+          <w:b/>
+        </w:rPr>
+        <w:t xml:space="preserve"> </w:t>
       </w:r>
       <w:r>
         <w:t xml:space="preserve">sous contrat à </w:t>
@@ -765,6 +780,14 @@
     </w:p>
     <w:p>
       <w:pPr>
+        <w:ind w:left="4248" w:firstLine="708"/>
+        <w:rPr>
+          <w:b/>
+        </w:rPr>
+      </w:pPr>
+    </w:p>
+    <w:p>
+      <w:pPr>
         <w:ind w:left="4248"/>
         <w:rPr>
           <w:b/>
@@ -788,6 +811,46 @@
         </w:rPr>
         <w:t xml:space="preserve"> </w:t>
       </w:r>
+    </w:p>
+    <w:p>
+      <w:pPr>
+        <w:ind w:left="4248"/>
+        <w:rPr>
+          <w:b/>
+        </w:rPr>
+      </w:pPr>
+    </w:p>
+    <w:p>
+      <w:pPr>
+        <w:ind w:left="4248"/>
+        <w:rPr>
+          <w:b/>
+        </w:rPr>
+      </w:pPr>
+    </w:p>
+    <w:p>
+      <w:pPr>
+        <w:ind w:left="4248"/>
+        <w:rPr>
+          <w:b/>
+        </w:rPr>
+      </w:pPr>
+    </w:p>
+    <w:p>
+      <w:pPr>
+        <w:ind w:left="4956" w:firstLine="708"/>
+        <w:rPr>
+          <w:b/>
+        </w:rPr>
+      </w:pPr>
+    </w:p>
+    <w:p>
+      <w:pPr>
+        <w:ind w:left="4956" w:firstLine="708"/>
+        <w:rPr>
+          <w:b/>
+        </w:rPr>
+      </w:pPr>
       <w:r>
         <w:rPr>
           <w:b/>
@@ -806,31 +869,7 @@
         <w:rPr>
           <w:b/>
         </w:rPr>
-        <w:t xml:space="preserve"> El </w:t>
-      </w:r>
-      <w:proofErr w:type="spellStart"/>
-      <w:r>
-        <w:rPr>
-          <w:b/>
-        </w:rPr>
-        <w:t>Yadri</w:t>
-      </w:r>
-      <w:proofErr w:type="spellEnd"/>
-    </w:p>
-    <w:p>
-      <w:pPr>
-        <w:ind w:left="3540" w:firstLine="708"/>
-        <w:rPr>
-          <w:b/>
-        </w:rPr>
-      </w:pPr>
-    </w:p>
-    <w:p>
-      <w:pPr>
-        <w:ind w:left="4956"/>
-      </w:pPr>
-      <w:r>
-        <w:t xml:space="preserve">                                             </w:t>
+        <w:t xml:space="preserve"> El Yadri</w:t>
       </w:r>
     </w:p>
     <w:p>
@@ -838,20 +877,12 @@
         <w:ind w:left="6372"/>
       </w:pPr>
       <w:r>
-        <w:t xml:space="preserve"> Site : </w:t>
-      </w:r>
-      <w:r>
-        <w:rPr>
-          <w:b/>
-          <w:bCs/>
-          <w:noProof/>
-        </w:rPr>
-        <w:t>Lieu de travail</w:t>
-      </w:r>
-    </w:p>
-    <w:p>
-      <w:pPr>
-        <w:ind w:left="7513" w:firstLine="567"/>
+        <w:t xml:space="preserve"> </w:t>
+      </w:r>
+    </w:p>
+    <w:p>
+      <w:pPr>
+        <w:ind w:left="6372"/>
         <w:sectPr>
           <w:footerReference w:type="default" r:id="rId8"/>
           <w:pgSz w:w="11906" w:h="16838"/>
@@ -862,7 +893,15 @@
         </w:sectPr>
       </w:pPr>
       <w:r>
-        <w:t xml:space="preserve">           </w:t>
+        <w:t xml:space="preserve">Site : </w:t>
+      </w:r>
+      <w:r>
+        <w:rPr>
+          <w:b/>
+          <w:bCs/>
+          <w:noProof/>
+        </w:rPr>
+        <w:t>Lieu de travail</w:t>
       </w:r>
     </w:p>
     <w:p>
@@ -881,13 +920,13 @@
           <w:u w:val="single"/>
         </w:rPr>
         <w:drawing>
-          <wp:anchor distT="0" distB="0" distL="114300" distR="114300" simplePos="0" relativeHeight="251658240" behindDoc="1" locked="0" layoutInCell="1" allowOverlap="1" wp14:anchorId="4808DF56" wp14:editId="774ACEA9">
+          <wp:anchor distT="0" distB="0" distL="114300" distR="114300" simplePos="0" relativeHeight="251658240" behindDoc="1" locked="0" layoutInCell="1" allowOverlap="1" wp14:anchorId="4808DF56" wp14:editId="3F4CCEE5">
             <wp:simplePos x="0" y="0"/>
             <wp:positionH relativeFrom="rightMargin">
               <wp:posOffset>66040</wp:posOffset>
             </wp:positionH>
             <wp:positionV relativeFrom="paragraph">
-              <wp:posOffset>634365</wp:posOffset>
+              <wp:posOffset>272415</wp:posOffset>
             </wp:positionV>
             <wp:extent cx="1217930" cy="586740"/>
             <wp:effectExtent l="0" t="0" r="1270" b="3810"/>
@@ -968,16 +1007,6 @@
         <w:fldChar w:fldCharType="end"/>
       </w:r>
     </w:p>
-    <w:p>
-      <w:pPr>
-        <w:rPr>
-          <w:b/>
-          <w:bCs/>
-          <w:u w:val="single"/>
-        </w:rPr>
-      </w:pPr>
-    </w:p>
-    <w:p/>
     <w:sectPr>
       <w:footerReference w:type="default" r:id="rId10"/>
       <w:type w:val="continuous"/>
@@ -991,7 +1020,7 @@
 </file>
 
 <file path=word/endnotes.xml><?xml version="1.0" encoding="utf-8"?>
-<w:endnotes xmlns:wpc="http://schemas.microsoft.com/office/word/2010/wordprocessingCanvas" xmlns:cx="http://schemas.microsoft.com/office/drawing/2014/chartex" xmlns:cx1="http://schemas.microsoft.com/office/drawing/2015/9/8/chartex" xmlns:cx2="http://schemas.microsoft.com/office/drawing/2015/10/21/chartex" xmlns:cx3="http://schemas.microsoft.com/office/drawing/2016/5/9/chartex" xmlns:cx4="http://schemas.microsoft.com/office/drawing/2016/5/10/chartex" xmlns:cx5="http://schemas.microsoft.com/office/drawing/2016/5/11/chartex" xmlns:cx6="http://schemas.microsoft.com/office/drawing/2016/5/12/chartex" xmlns:cx7="http://schemas.microsoft.com/office/drawing/2016/5/13/chartex" xmlns:cx8="http://schemas.microsoft.com/office/drawing/2016/5/14/chartex" xmlns:mc="http://schemas.openxmlformats.org/markup-compatibility/2006" xmlns:aink="http://schemas.microsoft.com/office/drawing/2016/ink" xmlns:am3d="http://schemas.microsoft.com/office/drawing/2017/model3d" xmlns:o="urn:schemas-microsoft-com:office:office" xmlns:r="http://schemas.openxmlformats.org/officeDocument/2006/relationships" xmlns:m="http://schemas.openxmlformats.org/officeDocument/2006/math" xmlns:v="urn:schemas-microsoft-com:vml" xmlns:wp14="http://schemas.microsoft.com/office/word/2010/wordprocessingDrawing" xmlns:wp="http://schemas.openxmlformats.org/drawingml/2006/wordprocessingDrawing" xmlns:w10="urn:schemas-microsoft-com:office:word" xmlns:w="http://schemas.openxmlformats.org/wordprocessingml/2006/main" xmlns:w14="http://schemas.microsoft.com/office/word/2010/wordml" xmlns:w15="http://schemas.microsoft.com/office/word/2012/wordml" xmlns:w16cex="http://schemas.microsoft.com/office/word/2018/wordml/cex" xmlns:w16cid="http://schemas.microsoft.com/office/word/2016/wordml/cid" xmlns:w16="http://schemas.microsoft.com/office/word/2018/wordml" xmlns:w16sdtdh="http://schemas.microsoft.com/office/word/2020/wordml/sdtdatahash" xmlns:w16se="http://schemas.microsoft.com/office/word/2015/wordml/symex" xmlns:wpg="http://schemas.microsoft.com/office/word/2010/wordprocessingGroup" xmlns:wpi="http://schemas.microsoft.com/office/word/2010/wordprocessingInk" xmlns:wne="http://schemas.microsoft.com/office/word/2006/wordml" xmlns:wps="http://schemas.microsoft.com/office/word/2010/wordprocessingShape" mc:Ignorable="w14 w15 w16se w16cid w16 w16cex w16sdtdh wp14">
+<w:endnotes xmlns:wpc="http://schemas.microsoft.com/office/word/2010/wordprocessingCanvas" xmlns:cx="http://schemas.microsoft.com/office/drawing/2014/chartex" xmlns:cx1="http://schemas.microsoft.com/office/drawing/2015/9/8/chartex" xmlns:cx2="http://schemas.microsoft.com/office/drawing/2015/10/21/chartex" xmlns:cx3="http://schemas.microsoft.com/office/drawing/2016/5/9/chartex" xmlns:cx4="http://schemas.microsoft.com/office/drawing/2016/5/10/chartex" xmlns:cx5="http://schemas.microsoft.com/office/drawing/2016/5/11/chartex" xmlns:cx6="http://schemas.microsoft.com/office/drawing/2016/5/12/chartex" xmlns:cx7="http://schemas.microsoft.com/office/drawing/2016/5/13/chartex" xmlns:cx8="http://schemas.microsoft.com/office/drawing/2016/5/14/chartex" xmlns:mc="http://schemas.openxmlformats.org/markup-compatibility/2006" xmlns:aink="http://schemas.microsoft.com/office/drawing/2016/ink" xmlns:am3d="http://schemas.microsoft.com/office/drawing/2017/model3d" xmlns:o="urn:schemas-microsoft-com:office:office" xmlns:oel="http://schemas.microsoft.com/office/2019/extlst" xmlns:r="http://schemas.openxmlformats.org/officeDocument/2006/relationships" xmlns:m="http://schemas.openxmlformats.org/officeDocument/2006/math" xmlns:v="urn:schemas-microsoft-com:vml" xmlns:wp14="http://schemas.microsoft.com/office/word/2010/wordprocessingDrawing" xmlns:wp="http://schemas.openxmlformats.org/drawingml/2006/wordprocessingDrawing" xmlns:w10="urn:schemas-microsoft-com:office:word" xmlns:w="http://schemas.openxmlformats.org/wordprocessingml/2006/main" xmlns:w14="http://schemas.microsoft.com/office/word/2010/wordml" xmlns:w15="http://schemas.microsoft.com/office/word/2012/wordml" xmlns:w16cex="http://schemas.microsoft.com/office/word/2018/wordml/cex" xmlns:w16cid="http://schemas.microsoft.com/office/word/2016/wordml/cid" xmlns:w16="http://schemas.microsoft.com/office/word/2018/wordml" xmlns:w16du="http://schemas.microsoft.com/office/word/2023/wordml/word16du" xmlns:w16sdtdh="http://schemas.microsoft.com/office/word/2020/wordml/sdtdatahash" xmlns:w16sdtfl="http://schemas.microsoft.com/office/word/2024/wordml/sdtformatlock" xmlns:w16se="http://schemas.microsoft.com/office/word/2015/wordml/symex" xmlns:wpg="http://schemas.microsoft.com/office/word/2010/wordprocessingGroup" xmlns:wpi="http://schemas.microsoft.com/office/word/2010/wordprocessingInk" xmlns:wne="http://schemas.microsoft.com/office/word/2006/wordml" xmlns:wps="http://schemas.microsoft.com/office/word/2010/wordprocessingShape" mc:Ignorable="w14 w15 w16se w16cid w16 w16cex w16sdtdh w16sdtfl w16du wp14">
   <w:endnote w:type="separator" w:id="-1">
     <w:p>
       <w:r>
@@ -1010,7 +1039,7 @@
 </file>
 
 <file path=word/footer1.xml><?xml version="1.0" encoding="utf-8"?>
-<w:ftr xmlns:wpc="http://schemas.microsoft.com/office/word/2010/wordprocessingCanvas" xmlns:cx="http://schemas.microsoft.com/office/drawing/2014/chartex" xmlns:cx1="http://schemas.microsoft.com/office/drawing/2015/9/8/chartex" xmlns:cx2="http://schemas.microsoft.com/office/drawing/2015/10/21/chartex" xmlns:cx3="http://schemas.microsoft.com/office/drawing/2016/5/9/chartex" xmlns:cx4="http://schemas.microsoft.com/office/drawing/2016/5/10/chartex" xmlns:cx5="http://schemas.microsoft.com/office/drawing/2016/5/11/chartex" xmlns:cx6="http://schemas.microsoft.com/office/drawing/2016/5/12/chartex" xmlns:cx7="http://schemas.microsoft.com/office/drawing/2016/5/13/chartex" xmlns:cx8="http://schemas.microsoft.com/office/drawing/2016/5/14/chartex" xmlns:mc="http://schemas.openxmlformats.org/markup-compatibility/2006" xmlns:aink="http://schemas.microsoft.com/office/drawing/2016/ink" xmlns:am3d="http://schemas.microsoft.com/office/drawing/2017/model3d" xmlns:o="urn:schemas-microsoft-com:office:office" xmlns:r="http://schemas.openxmlformats.org/officeDocument/2006/relationships" xmlns:m="http://schemas.openxmlformats.org/officeDocument/2006/math" xmlns:v="urn:schemas-microsoft-com:vml" xmlns:wp14="http://schemas.microsoft.com/office/word/2010/wordprocessingDrawing" xmlns:wp="http://schemas.openxmlformats.org/drawingml/2006/wordprocessingDrawing" xmlns:w10="urn:schemas-microsoft-com:office:word" xmlns:w="http://schemas.openxmlformats.org/wordprocessingml/2006/main" xmlns:w14="http://schemas.microsoft.com/office/word/2010/wordml" xmlns:w15="http://schemas.microsoft.com/office/word/2012/wordml" xmlns:w16cex="http://schemas.microsoft.com/office/word/2018/wordml/cex" xmlns:w16cid="http://schemas.microsoft.com/office/word/2016/wordml/cid" xmlns:w16="http://schemas.microsoft.com/office/word/2018/wordml" xmlns:w16sdtdh="http://schemas.microsoft.com/office/word/2020/wordml/sdtdatahash" xmlns:w16se="http://schemas.microsoft.com/office/word/2015/wordml/symex" xmlns:wpg="http://schemas.microsoft.com/office/word/2010/wordprocessingGroup" xmlns:wpi="http://schemas.microsoft.com/office/word/2010/wordprocessingInk" xmlns:wne="http://schemas.microsoft.com/office/word/2006/wordml" xmlns:wps="http://schemas.microsoft.com/office/word/2010/wordprocessingShape" mc:Ignorable="w14 w15 w16se w16cid w16 w16cex w16sdtdh wp14">
+<w:ftr xmlns:wpc="http://schemas.microsoft.com/office/word/2010/wordprocessingCanvas" xmlns:cx="http://schemas.microsoft.com/office/drawing/2014/chartex" xmlns:cx1="http://schemas.microsoft.com/office/drawing/2015/9/8/chartex" xmlns:cx2="http://schemas.microsoft.com/office/drawing/2015/10/21/chartex" xmlns:cx3="http://schemas.microsoft.com/office/drawing/2016/5/9/chartex" xmlns:cx4="http://schemas.microsoft.com/office/drawing/2016/5/10/chartex" xmlns:cx5="http://schemas.microsoft.com/office/drawing/2016/5/11/chartex" xmlns:cx6="http://schemas.microsoft.com/office/drawing/2016/5/12/chartex" xmlns:cx7="http://schemas.microsoft.com/office/drawing/2016/5/13/chartex" xmlns:cx8="http://schemas.microsoft.com/office/drawing/2016/5/14/chartex" xmlns:mc="http://schemas.openxmlformats.org/markup-compatibility/2006" xmlns:aink="http://schemas.microsoft.com/office/drawing/2016/ink" xmlns:am3d="http://schemas.microsoft.com/office/drawing/2017/model3d" xmlns:o="urn:schemas-microsoft-com:office:office" xmlns:oel="http://schemas.microsoft.com/office/2019/extlst" xmlns:r="http://schemas.openxmlformats.org/officeDocument/2006/relationships" xmlns:m="http://schemas.openxmlformats.org/officeDocument/2006/math" xmlns:v="urn:schemas-microsoft-com:vml" xmlns:wp14="http://schemas.microsoft.com/office/word/2010/wordprocessingDrawing" xmlns:wp="http://schemas.openxmlformats.org/drawingml/2006/wordprocessingDrawing" xmlns:w10="urn:schemas-microsoft-com:office:word" xmlns:w="http://schemas.openxmlformats.org/wordprocessingml/2006/main" xmlns:w14="http://schemas.microsoft.com/office/word/2010/wordml" xmlns:w15="http://schemas.microsoft.com/office/word/2012/wordml" xmlns:w16cex="http://schemas.microsoft.com/office/word/2018/wordml/cex" xmlns:w16cid="http://schemas.microsoft.com/office/word/2016/wordml/cid" xmlns:w16="http://schemas.microsoft.com/office/word/2018/wordml" xmlns:w16du="http://schemas.microsoft.com/office/word/2023/wordml/word16du" xmlns:w16sdtdh="http://schemas.microsoft.com/office/word/2020/wordml/sdtdatahash" xmlns:w16sdtfl="http://schemas.microsoft.com/office/word/2024/wordml/sdtformatlock" xmlns:w16se="http://schemas.microsoft.com/office/word/2015/wordml/symex" xmlns:wpg="http://schemas.microsoft.com/office/word/2010/wordprocessingGroup" xmlns:wpi="http://schemas.microsoft.com/office/word/2010/wordprocessingInk" xmlns:wne="http://schemas.microsoft.com/office/word/2006/wordml" xmlns:wps="http://schemas.microsoft.com/office/word/2010/wordprocessingShape" mc:Ignorable="w14 w15 w16se w16cid w16 w16cex w16sdtdh w16sdtfl w16du wp14">
   <w:p>
     <w:pPr>
       <w:pStyle w:val="Pieddepage"/>
@@ -1027,7 +1056,7 @@
         <w:szCs w:val="20"/>
         <w:lang w:val="en-US"/>
       </w:rPr>
-      <w:t xml:space="preserve">Lot ITV 27 </w:t>
+      <w:t xml:space="preserve">Lot ITV 27 ter </w:t>
     </w:r>
     <w:proofErr w:type="spellStart"/>
     <w:r>
@@ -1036,7 +1065,7 @@
         <w:szCs w:val="20"/>
         <w:lang w:val="en-US"/>
       </w:rPr>
-      <w:t>ter</w:t>
+      <w:t>Andrefantsena</w:t>
     </w:r>
     <w:proofErr w:type="spellEnd"/>
     <w:r>
@@ -1054,7 +1083,7 @@
         <w:szCs w:val="20"/>
         <w:lang w:val="en-US"/>
       </w:rPr>
-      <w:t>Andrefantsena</w:t>
+      <w:t>Itaosy</w:t>
     </w:r>
     <w:proofErr w:type="spellEnd"/>
     <w:r>
@@ -1063,6 +1092,42 @@
         <w:szCs w:val="20"/>
         <w:lang w:val="en-US"/>
       </w:rPr>
+      <w:t xml:space="preserve">- Antananarivo 102- </w:t>
+    </w:r>
+    <w:proofErr w:type="spellStart"/>
+    <w:r>
+      <w:rPr>
+        <w:sz w:val="20"/>
+        <w:szCs w:val="20"/>
+        <w:lang w:val="en-US"/>
+      </w:rPr>
+      <w:t>Andranonahoatra</w:t>
+    </w:r>
+    <w:proofErr w:type="spellEnd"/>
+    <w:r>
+      <w:rPr>
+        <w:sz w:val="20"/>
+        <w:szCs w:val="20"/>
+        <w:lang w:val="en-US"/>
+      </w:rPr>
+      <w:t xml:space="preserve"> – RCS: 2003 B 710 – </w:t>
+    </w:r>
+    <w:proofErr w:type="spellStart"/>
+    <w:r>
+      <w:rPr>
+        <w:sz w:val="20"/>
+        <w:szCs w:val="20"/>
+        <w:lang w:val="en-US"/>
+      </w:rPr>
+      <w:t>Numéro</w:t>
+    </w:r>
+    <w:proofErr w:type="spellEnd"/>
+    <w:r>
+      <w:rPr>
+        <w:sz w:val="20"/>
+        <w:szCs w:val="20"/>
+        <w:lang w:val="en-US"/>
+      </w:rPr>
       <w:t xml:space="preserve"> </w:t>
     </w:r>
     <w:proofErr w:type="spellStart"/>
@@ -1072,7 +1137,7 @@
         <w:szCs w:val="20"/>
         <w:lang w:val="en-US"/>
       </w:rPr>
-      <w:t>Itaosy</w:t>
+      <w:t>d’indentification</w:t>
     </w:r>
     <w:proofErr w:type="spellEnd"/>
     <w:r>
@@ -1081,7 +1146,7 @@
         <w:szCs w:val="20"/>
         <w:lang w:val="en-US"/>
       </w:rPr>
-      <w:t xml:space="preserve">- Antananarivo 102- </w:t>
+      <w:t xml:space="preserve">: 46101 11 1990 010010 - </w:t>
     </w:r>
     <w:proofErr w:type="spellStart"/>
     <w:r>
@@ -1090,7 +1155,7 @@
         <w:szCs w:val="20"/>
         <w:lang w:val="en-US"/>
       </w:rPr>
-      <w:t>Andranonahoatra</w:t>
+      <w:t>Numéro</w:t>
     </w:r>
     <w:proofErr w:type="spellEnd"/>
     <w:r>
@@ -1099,7 +1164,7 @@
         <w:szCs w:val="20"/>
         <w:lang w:val="en-US"/>
       </w:rPr>
-      <w:t xml:space="preserve"> – RCS: 2003 B 710 – </w:t>
+      <w:t xml:space="preserve"> </w:t>
     </w:r>
     <w:proofErr w:type="spellStart"/>
     <w:r>
@@ -1108,7 +1173,7 @@
         <w:szCs w:val="20"/>
         <w:lang w:val="en-US"/>
       </w:rPr>
-      <w:t>Numéro</w:t>
+      <w:t>d’Identification</w:t>
     </w:r>
     <w:proofErr w:type="spellEnd"/>
     <w:r>
@@ -1119,60 +1184,6 @@
       </w:rPr>
       <w:t xml:space="preserve"> </w:t>
     </w:r>
-    <w:proofErr w:type="spellStart"/>
-    <w:r>
-      <w:rPr>
-        <w:sz w:val="20"/>
-        <w:szCs w:val="20"/>
-        <w:lang w:val="en-US"/>
-      </w:rPr>
-      <w:t>d’indentification</w:t>
-    </w:r>
-    <w:proofErr w:type="spellEnd"/>
-    <w:r>
-      <w:rPr>
-        <w:sz w:val="20"/>
-        <w:szCs w:val="20"/>
-        <w:lang w:val="en-US"/>
-      </w:rPr>
-      <w:t xml:space="preserve">: 46101 11 1990 010010 - </w:t>
-    </w:r>
-    <w:proofErr w:type="spellStart"/>
-    <w:r>
-      <w:rPr>
-        <w:sz w:val="20"/>
-        <w:szCs w:val="20"/>
-        <w:lang w:val="en-US"/>
-      </w:rPr>
-      <w:t>Numéro</w:t>
-    </w:r>
-    <w:proofErr w:type="spellEnd"/>
-    <w:r>
-      <w:rPr>
-        <w:sz w:val="20"/>
-        <w:szCs w:val="20"/>
-        <w:lang w:val="en-US"/>
-      </w:rPr>
-      <w:t xml:space="preserve"> </w:t>
-    </w:r>
-    <w:proofErr w:type="spellStart"/>
-    <w:r>
-      <w:rPr>
-        <w:sz w:val="20"/>
-        <w:szCs w:val="20"/>
-        <w:lang w:val="en-US"/>
-      </w:rPr>
-      <w:t>d’Identification</w:t>
-    </w:r>
-    <w:proofErr w:type="spellEnd"/>
-    <w:r>
-      <w:rPr>
-        <w:sz w:val="20"/>
-        <w:szCs w:val="20"/>
-        <w:lang w:val="en-US"/>
-      </w:rPr>
-      <w:t xml:space="preserve"> </w:t>
-    </w:r>
     <w:proofErr w:type="gramStart"/>
     <w:r>
       <w:rPr>
@@ -1189,15 +1200,33 @@
         <w:szCs w:val="20"/>
         <w:lang w:val="en-US"/>
       </w:rPr>
-      <w:t xml:space="preserve"> 5000056860- BP: 9022</w:t>
-    </w:r>
-    <w:r>
-      <w:rPr>
-        <w:sz w:val="20"/>
-        <w:szCs w:val="20"/>
-        <w:lang w:val="en-US"/>
-      </w:rPr>
-      <w:t xml:space="preserve">  -                             </w:t>
+      <w:t xml:space="preserve"> 5000056860- BP: </w:t>
+    </w:r>
+    <w:proofErr w:type="gramStart"/>
+    <w:r>
+      <w:rPr>
+        <w:sz w:val="20"/>
+        <w:szCs w:val="20"/>
+        <w:lang w:val="en-US"/>
+      </w:rPr>
+      <w:t>9022</w:t>
+    </w:r>
+    <w:r>
+      <w:rPr>
+        <w:sz w:val="20"/>
+        <w:szCs w:val="20"/>
+        <w:lang w:val="en-US"/>
+      </w:rPr>
+      <w:t xml:space="preserve">  -</w:t>
+    </w:r>
+    <w:proofErr w:type="gramEnd"/>
+    <w:r>
+      <w:rPr>
+        <w:sz w:val="20"/>
+        <w:szCs w:val="20"/>
+        <w:lang w:val="en-US"/>
+      </w:rPr>
+      <w:t xml:space="preserve">                             </w:t>
     </w:r>
     <w:r>
       <w:rPr>
@@ -1230,7 +1259,7 @@
 </file>
 
 <file path=word/footer2.xml><?xml version="1.0" encoding="utf-8"?>
-<w:ftr xmlns:wpc="http://schemas.microsoft.com/office/word/2010/wordprocessingCanvas" xmlns:cx="http://schemas.microsoft.com/office/drawing/2014/chartex" xmlns:cx1="http://schemas.microsoft.com/office/drawing/2015/9/8/chartex" xmlns:cx2="http://schemas.microsoft.com/office/drawing/2015/10/21/chartex" xmlns:cx3="http://schemas.microsoft.com/office/drawing/2016/5/9/chartex" xmlns:cx4="http://schemas.microsoft.com/office/drawing/2016/5/10/chartex" xmlns:cx5="http://schemas.microsoft.com/office/drawing/2016/5/11/chartex" xmlns:cx6="http://schemas.microsoft.com/office/drawing/2016/5/12/chartex" xmlns:cx7="http://schemas.microsoft.com/office/drawing/2016/5/13/chartex" xmlns:cx8="http://schemas.microsoft.com/office/drawing/2016/5/14/chartex" xmlns:mc="http://schemas.openxmlformats.org/markup-compatibility/2006" xmlns:aink="http://schemas.microsoft.com/office/drawing/2016/ink" xmlns:am3d="http://schemas.microsoft.com/office/drawing/2017/model3d" xmlns:o="urn:schemas-microsoft-com:office:office" xmlns:r="http://schemas.openxmlformats.org/officeDocument/2006/relationships" xmlns:m="http://schemas.openxmlformats.org/officeDocument/2006/math" xmlns:v="urn:schemas-microsoft-com:vml" xmlns:wp14="http://schemas.microsoft.com/office/word/2010/wordprocessingDrawing" xmlns:wp="http://schemas.openxmlformats.org/drawingml/2006/wordprocessingDrawing" xmlns:w10="urn:schemas-microsoft-com:office:word" xmlns:w="http://schemas.openxmlformats.org/wordprocessingml/2006/main" xmlns:w14="http://schemas.microsoft.com/office/word/2010/wordml" xmlns:w15="http://schemas.microsoft.com/office/word/2012/wordml" xmlns:w16cex="http://schemas.microsoft.com/office/word/2018/wordml/cex" xmlns:w16cid="http://schemas.microsoft.com/office/word/2016/wordml/cid" xmlns:w16="http://schemas.microsoft.com/office/word/2018/wordml" xmlns:w16sdtdh="http://schemas.microsoft.com/office/word/2020/wordml/sdtdatahash" xmlns:w16se="http://schemas.microsoft.com/office/word/2015/wordml/symex" xmlns:wpg="http://schemas.microsoft.com/office/word/2010/wordprocessingGroup" xmlns:wpi="http://schemas.microsoft.com/office/word/2010/wordprocessingInk" xmlns:wne="http://schemas.microsoft.com/office/word/2006/wordml" xmlns:wps="http://schemas.microsoft.com/office/word/2010/wordprocessingShape" mc:Ignorable="w14 w15 w16se w16cid w16 w16cex w16sdtdh wp14">
+<w:ftr xmlns:wpc="http://schemas.microsoft.com/office/word/2010/wordprocessingCanvas" xmlns:cx="http://schemas.microsoft.com/office/drawing/2014/chartex" xmlns:cx1="http://schemas.microsoft.com/office/drawing/2015/9/8/chartex" xmlns:cx2="http://schemas.microsoft.com/office/drawing/2015/10/21/chartex" xmlns:cx3="http://schemas.microsoft.com/office/drawing/2016/5/9/chartex" xmlns:cx4="http://schemas.microsoft.com/office/drawing/2016/5/10/chartex" xmlns:cx5="http://schemas.microsoft.com/office/drawing/2016/5/11/chartex" xmlns:cx6="http://schemas.microsoft.com/office/drawing/2016/5/12/chartex" xmlns:cx7="http://schemas.microsoft.com/office/drawing/2016/5/13/chartex" xmlns:cx8="http://schemas.microsoft.com/office/drawing/2016/5/14/chartex" xmlns:mc="http://schemas.openxmlformats.org/markup-compatibility/2006" xmlns:aink="http://schemas.microsoft.com/office/drawing/2016/ink" xmlns:am3d="http://schemas.microsoft.com/office/drawing/2017/model3d" xmlns:o="urn:schemas-microsoft-com:office:office" xmlns:oel="http://schemas.microsoft.com/office/2019/extlst" xmlns:r="http://schemas.openxmlformats.org/officeDocument/2006/relationships" xmlns:m="http://schemas.openxmlformats.org/officeDocument/2006/math" xmlns:v="urn:schemas-microsoft-com:vml" xmlns:wp14="http://schemas.microsoft.com/office/word/2010/wordprocessingDrawing" xmlns:wp="http://schemas.openxmlformats.org/drawingml/2006/wordprocessingDrawing" xmlns:w10="urn:schemas-microsoft-com:office:word" xmlns:w="http://schemas.openxmlformats.org/wordprocessingml/2006/main" xmlns:w14="http://schemas.microsoft.com/office/word/2010/wordml" xmlns:w15="http://schemas.microsoft.com/office/word/2012/wordml" xmlns:w16cex="http://schemas.microsoft.com/office/word/2018/wordml/cex" xmlns:w16cid="http://schemas.microsoft.com/office/word/2016/wordml/cid" xmlns:w16="http://schemas.microsoft.com/office/word/2018/wordml" xmlns:w16du="http://schemas.microsoft.com/office/word/2023/wordml/word16du" xmlns:w16sdtdh="http://schemas.microsoft.com/office/word/2020/wordml/sdtdatahash" xmlns:w16sdtfl="http://schemas.microsoft.com/office/word/2024/wordml/sdtformatlock" xmlns:w16se="http://schemas.microsoft.com/office/word/2015/wordml/symex" xmlns:wpg="http://schemas.microsoft.com/office/word/2010/wordprocessingGroup" xmlns:wpi="http://schemas.microsoft.com/office/word/2010/wordprocessingInk" xmlns:wne="http://schemas.microsoft.com/office/word/2006/wordml" xmlns:wps="http://schemas.microsoft.com/office/word/2010/wordprocessingShape" mc:Ignorable="w14 w15 w16se w16cid w16 w16cex w16sdtdh w16sdtfl w16du wp14">
   <w:p>
     <w:pPr>
       <w:pStyle w:val="Pieddepage"/>
@@ -1246,25 +1275,7 @@
         <w:szCs w:val="20"/>
         <w:lang w:val="en-US"/>
       </w:rPr>
-      <w:t xml:space="preserve">Lot ITV 27 </w:t>
-    </w:r>
-    <w:proofErr w:type="spellStart"/>
-    <w:r>
-      <w:rPr>
-        <w:sz w:val="20"/>
-        <w:szCs w:val="20"/>
-        <w:lang w:val="en-US"/>
-      </w:rPr>
-      <w:t>ter</w:t>
-    </w:r>
-    <w:proofErr w:type="spellEnd"/>
-    <w:r>
-      <w:rPr>
-        <w:sz w:val="20"/>
-        <w:szCs w:val="20"/>
-        <w:lang w:val="en-US"/>
-      </w:rPr>
-      <w:t xml:space="preserve"> </w:t>
+      <w:t xml:space="preserve">Lot ITV 27 ter </w:t>
     </w:r>
     <w:proofErr w:type="spellStart"/>
     <w:r>
@@ -1431,7 +1442,7 @@
 </file>
 
 <file path=word/footnotes.xml><?xml version="1.0" encoding="utf-8"?>
-<w:footnotes xmlns:wpc="http://schemas.microsoft.com/office/word/2010/wordprocessingCanvas" xmlns:cx="http://schemas.microsoft.com/office/drawing/2014/chartex" xmlns:cx1="http://schemas.microsoft.com/office/drawing/2015/9/8/chartex" xmlns:cx2="http://schemas.microsoft.com/office/drawing/2015/10/21/chartex" xmlns:cx3="http://schemas.microsoft.com/office/drawing/2016/5/9/chartex" xmlns:cx4="http://schemas.microsoft.com/office/drawing/2016/5/10/chartex" xmlns:cx5="http://schemas.microsoft.com/office/drawing/2016/5/11/chartex" xmlns:cx6="http://schemas.microsoft.com/office/drawing/2016/5/12/chartex" xmlns:cx7="http://schemas.microsoft.com/office/drawing/2016/5/13/chartex" xmlns:cx8="http://schemas.microsoft.com/office/drawing/2016/5/14/chartex" xmlns:mc="http://schemas.openxmlformats.org/markup-compatibility/2006" xmlns:aink="http://schemas.microsoft.com/office/drawing/2016/ink" xmlns:am3d="http://schemas.microsoft.com/office/drawing/2017/model3d" xmlns:o="urn:schemas-microsoft-com:office:office" xmlns:r="http://schemas.openxmlformats.org/officeDocument/2006/relationships" xmlns:m="http://schemas.openxmlformats.org/officeDocument/2006/math" xmlns:v="urn:schemas-microsoft-com:vml" xmlns:wp14="http://schemas.microsoft.com/office/word/2010/wordprocessingDrawing" xmlns:wp="http://schemas.openxmlformats.org/drawingml/2006/wordprocessingDrawing" xmlns:w10="urn:schemas-microsoft-com:office:word" xmlns:w="http://schemas.openxmlformats.org/wordprocessingml/2006/main" xmlns:w14="http://schemas.microsoft.com/office/word/2010/wordml" xmlns:w15="http://schemas.microsoft.com/office/word/2012/wordml" xmlns:w16cex="http://schemas.microsoft.com/office/word/2018/wordml/cex" xmlns:w16cid="http://schemas.microsoft.com/office/word/2016/wordml/cid" xmlns:w16="http://schemas.microsoft.com/office/word/2018/wordml" xmlns:w16sdtdh="http://schemas.microsoft.com/office/word/2020/wordml/sdtdatahash" xmlns:w16se="http://schemas.microsoft.com/office/word/2015/wordml/symex" xmlns:wpg="http://schemas.microsoft.com/office/word/2010/wordprocessingGroup" xmlns:wpi="http://schemas.microsoft.com/office/word/2010/wordprocessingInk" xmlns:wne="http://schemas.microsoft.com/office/word/2006/wordml" xmlns:wps="http://schemas.microsoft.com/office/word/2010/wordprocessingShape" mc:Ignorable="w14 w15 w16se w16cid w16 w16cex w16sdtdh wp14">
+<w:footnotes xmlns:wpc="http://schemas.microsoft.com/office/word/2010/wordprocessingCanvas" xmlns:cx="http://schemas.microsoft.com/office/drawing/2014/chartex" xmlns:cx1="http://schemas.microsoft.com/office/drawing/2015/9/8/chartex" xmlns:cx2="http://schemas.microsoft.com/office/drawing/2015/10/21/chartex" xmlns:cx3="http://schemas.microsoft.com/office/drawing/2016/5/9/chartex" xmlns:cx4="http://schemas.microsoft.com/office/drawing/2016/5/10/chartex" xmlns:cx5="http://schemas.microsoft.com/office/drawing/2016/5/11/chartex" xmlns:cx6="http://schemas.microsoft.com/office/drawing/2016/5/12/chartex" xmlns:cx7="http://schemas.microsoft.com/office/drawing/2016/5/13/chartex" xmlns:cx8="http://schemas.microsoft.com/office/drawing/2016/5/14/chartex" xmlns:mc="http://schemas.openxmlformats.org/markup-compatibility/2006" xmlns:aink="http://schemas.microsoft.com/office/drawing/2016/ink" xmlns:am3d="http://schemas.microsoft.com/office/drawing/2017/model3d" xmlns:o="urn:schemas-microsoft-com:office:office" xmlns:oel="http://schemas.microsoft.com/office/2019/extlst" xmlns:r="http://schemas.openxmlformats.org/officeDocument/2006/relationships" xmlns:m="http://schemas.openxmlformats.org/officeDocument/2006/math" xmlns:v="urn:schemas-microsoft-com:vml" xmlns:wp14="http://schemas.microsoft.com/office/word/2010/wordprocessingDrawing" xmlns:wp="http://schemas.openxmlformats.org/drawingml/2006/wordprocessingDrawing" xmlns:w10="urn:schemas-microsoft-com:office:word" xmlns:w="http://schemas.openxmlformats.org/wordprocessingml/2006/main" xmlns:w14="http://schemas.microsoft.com/office/word/2010/wordml" xmlns:w15="http://schemas.microsoft.com/office/word/2012/wordml" xmlns:w16cex="http://schemas.microsoft.com/office/word/2018/wordml/cex" xmlns:w16cid="http://schemas.microsoft.com/office/word/2016/wordml/cid" xmlns:w16="http://schemas.microsoft.com/office/word/2018/wordml" xmlns:w16du="http://schemas.microsoft.com/office/word/2023/wordml/word16du" xmlns:w16sdtdh="http://schemas.microsoft.com/office/word/2020/wordml/sdtdatahash" xmlns:w16sdtfl="http://schemas.microsoft.com/office/word/2024/wordml/sdtformatlock" xmlns:w16se="http://schemas.microsoft.com/office/word/2015/wordml/symex" xmlns:wpg="http://schemas.microsoft.com/office/word/2010/wordprocessingGroup" xmlns:wpi="http://schemas.microsoft.com/office/word/2010/wordprocessingInk" xmlns:wne="http://schemas.microsoft.com/office/word/2006/wordml" xmlns:wps="http://schemas.microsoft.com/office/word/2010/wordprocessingShape" mc:Ignorable="w14 w15 w16se w16cid w16 w16cex w16sdtdh w16sdtfl w16du wp14">
   <w:footnote w:type="separator" w:id="-1">
     <w:p>
       <w:r>
@@ -1450,7 +1461,7 @@
 </file>
 
 <file path=word/styles.xml><?xml version="1.0" encoding="utf-8"?>
-<w:styles xmlns:mc="http://schemas.openxmlformats.org/markup-compatibility/2006" xmlns:r="http://schemas.openxmlformats.org/officeDocument/2006/relationships" xmlns:w="http://schemas.openxmlformats.org/wordprocessingml/2006/main" xmlns:w14="http://schemas.microsoft.com/office/word/2010/wordml" xmlns:w15="http://schemas.microsoft.com/office/word/2012/wordml" xmlns:w16cex="http://schemas.microsoft.com/office/word/2018/wordml/cex" xmlns:w16cid="http://schemas.microsoft.com/office/word/2016/wordml/cid" xmlns:w16="http://schemas.microsoft.com/office/word/2018/wordml" xmlns:w16sdtdh="http://schemas.microsoft.com/office/word/2020/wordml/sdtdatahash" xmlns:w16se="http://schemas.microsoft.com/office/word/2015/wordml/symex" mc:Ignorable="w14 w15 w16se w16cid w16 w16cex w16sdtdh">
+<w:styles xmlns:mc="http://schemas.openxmlformats.org/markup-compatibility/2006" xmlns:r="http://schemas.openxmlformats.org/officeDocument/2006/relationships" xmlns:w="http://schemas.openxmlformats.org/wordprocessingml/2006/main" xmlns:w14="http://schemas.microsoft.com/office/word/2010/wordml" xmlns:w15="http://schemas.microsoft.com/office/word/2012/wordml" xmlns:w16cex="http://schemas.microsoft.com/office/word/2018/wordml/cex" xmlns:w16cid="http://schemas.microsoft.com/office/word/2016/wordml/cid" xmlns:w16="http://schemas.microsoft.com/office/word/2018/wordml" xmlns:w16du="http://schemas.microsoft.com/office/word/2023/wordml/word16du" xmlns:w16sdtdh="http://schemas.microsoft.com/office/word/2020/wordml/sdtdatahash" xmlns:w16sdtfl="http://schemas.microsoft.com/office/word/2024/wordml/sdtformatlock" xmlns:w16se="http://schemas.microsoft.com/office/word/2015/wordml/symex" mc:Ignorable="w14 w15 w16se w16cid w16 w16cex w16sdtdh w16sdtfl w16du">
   <w:docDefaults>
     <w:rPrDefault>
       <w:rPr>

</xml_diff>

<commit_message>
chore: import prod hotfixes (recrutement, sanctions, leaves, presence, attestations)
</commit_message>
<xml_diff>
--- a/django_hr/documents/templates/BASE_ATTESTATION.docx
+++ b/django_hr/documents/templates/BASE_ATTESTATION.docx
@@ -14,125 +14,16 @@
       </w:pPr>
       <w:r>
         <w:rPr>
-          <w:rFonts w:ascii="Times New Roman" w:hAnsi="Times New Roman" w:cs="Times New Roman"/>
-          <w:sz w:val="20"/>
-          <w:szCs w:val="20"/>
-        </w:rPr>
-        <w:t xml:space="preserve"> </w:t>
-      </w:r>
-    </w:p>
-    <w:p>
-      <w:pPr>
-        <w:pStyle w:val="Textebrut"/>
-        <w:ind w:left="1134" w:right="6377"/>
-        <w:rPr>
-          <w:rFonts w:ascii="Times New Roman" w:hAnsi="Times New Roman" w:cs="Times New Roman"/>
-          <w:sz w:val="20"/>
-          <w:szCs w:val="20"/>
-        </w:rPr>
-      </w:pPr>
-      <w:r>
-        <w:rPr>
-          <w:rFonts w:ascii="Times New Roman" w:hAnsi="Times New Roman" w:cs="Times New Roman"/>
-          <w:sz w:val="20"/>
-          <w:szCs w:val="20"/>
-        </w:rPr>
-        <w:t xml:space="preserve">                                                                                   </w:t>
-      </w:r>
-    </w:p>
-    <w:p>
-      <w:pPr>
-        <w:pStyle w:val="Textebrut"/>
-        <w:ind w:left="3540" w:right="6377"/>
-        <w:rPr>
-          <w:rFonts w:ascii="Times New Roman" w:hAnsi="Times New Roman" w:cs="Times New Roman"/>
-          <w:sz w:val="20"/>
-          <w:szCs w:val="20"/>
-        </w:rPr>
-      </w:pPr>
-      <w:r>
-        <w:rPr>
-          <w:rFonts w:ascii="Times New Roman" w:hAnsi="Times New Roman" w:cs="Times New Roman"/>
-          <w:sz w:val="20"/>
-          <w:szCs w:val="20"/>
-        </w:rPr>
-        <w:t xml:space="preserve">            </w:t>
-      </w:r>
-      <w:r>
-        <w:rPr>
-          <w:rFonts w:ascii="Times New Roman" w:hAnsi="Times New Roman" w:cs="Times New Roman"/>
-          <w:sz w:val="20"/>
-          <w:szCs w:val="20"/>
-        </w:rPr>
-        <w:t xml:space="preserve">  </w:t>
-      </w:r>
-      <w:r>
-        <w:rPr>
-          <w:rFonts w:ascii="Times New Roman" w:hAnsi="Times New Roman" w:cs="Times New Roman"/>
-          <w:sz w:val="20"/>
-          <w:szCs w:val="20"/>
-        </w:rPr>
-        <w:t xml:space="preserve">  </w:t>
-      </w:r>
-      <w:r>
-        <w:rPr>
-          <w:rFonts w:ascii="Times New Roman" w:hAnsi="Times New Roman" w:cs="Times New Roman"/>
-          <w:sz w:val="20"/>
-          <w:szCs w:val="20"/>
-        </w:rPr>
-        <w:t xml:space="preserve">  </w:t>
-      </w:r>
-      <w:r>
-        <w:rPr>
-          <w:rFonts w:ascii="Times New Roman" w:hAnsi="Times New Roman" w:cs="Times New Roman"/>
-          <w:sz w:val="20"/>
-          <w:szCs w:val="20"/>
-        </w:rPr>
-        <w:t xml:space="preserve">            </w:t>
-      </w:r>
-    </w:p>
-    <w:p>
-      <w:pPr>
-        <w:pStyle w:val="Textebrut"/>
-        <w:ind w:right="6377"/>
-        <w:rPr>
-          <w:rFonts w:ascii="Times New Roman" w:hAnsi="Times New Roman" w:cs="Times New Roman"/>
-          <w:sz w:val="20"/>
-          <w:szCs w:val="20"/>
-        </w:rPr>
-      </w:pPr>
-      <w:r>
-        <w:rPr>
-          <w:rFonts w:ascii="Times New Roman" w:hAnsi="Times New Roman" w:cs="Times New Roman"/>
-          <w:sz w:val="20"/>
-          <w:szCs w:val="20"/>
-        </w:rPr>
-        <w:t xml:space="preserve">            </w:t>
-      </w:r>
-    </w:p>
-    <w:p>
-      <w:pPr>
-        <w:pStyle w:val="Textebrut"/>
-        <w:ind w:right="6377"/>
-        <w:rPr>
-          <w:rFonts w:ascii="Times New Roman" w:hAnsi="Times New Roman" w:cs="Times New Roman"/>
-          <w:b/>
-          <w:sz w:val="20"/>
-          <w:szCs w:val="20"/>
-        </w:rPr>
-      </w:pPr>
-      <w:r>
-        <w:rPr>
           <w:noProof/>
         </w:rPr>
         <w:drawing>
-          <wp:anchor distT="0" distB="0" distL="114300" distR="114300" simplePos="0" relativeHeight="251659264" behindDoc="1" locked="0" layoutInCell="1" allowOverlap="1" wp14:anchorId="7AA42512" wp14:editId="0BBC3FA6">
+          <wp:anchor distT="0" distB="0" distL="114300" distR="114300" simplePos="0" relativeHeight="251659264" behindDoc="1" locked="0" layoutInCell="1" allowOverlap="1" wp14:anchorId="7AA42512" wp14:editId="3C434CD9">
             <wp:simplePos x="0" y="0"/>
             <wp:positionH relativeFrom="page">
-              <wp:posOffset>2705100</wp:posOffset>
+              <wp:posOffset>2695575</wp:posOffset>
             </wp:positionH>
             <wp:positionV relativeFrom="paragraph">
-              <wp:posOffset>11430</wp:posOffset>
+              <wp:posOffset>5080</wp:posOffset>
             </wp:positionV>
             <wp:extent cx="2241542" cy="1419225"/>
             <wp:effectExtent l="0" t="0" r="6985" b="0"/>
@@ -194,15 +85,121 @@
           <w:sz w:val="20"/>
           <w:szCs w:val="20"/>
         </w:rPr>
+        <w:t xml:space="preserve"> </w:t>
+      </w:r>
+    </w:p>
+    <w:p>
+      <w:pPr>
+        <w:pStyle w:val="Textebrut"/>
+        <w:ind w:left="1134" w:right="6377"/>
+        <w:rPr>
+          <w:rFonts w:ascii="Times New Roman" w:hAnsi="Times New Roman" w:cs="Times New Roman"/>
+          <w:sz w:val="20"/>
+          <w:szCs w:val="20"/>
+        </w:rPr>
+      </w:pPr>
+      <w:r>
+        <w:rPr>
+          <w:rFonts w:ascii="Times New Roman" w:hAnsi="Times New Roman" w:cs="Times New Roman"/>
+          <w:sz w:val="20"/>
+          <w:szCs w:val="20"/>
+        </w:rPr>
+        <w:t xml:space="preserve">                                                                </w:t>
+      </w:r>
+    </w:p>
+    <w:p>
+      <w:pPr>
+        <w:pStyle w:val="Textebrut"/>
+        <w:ind w:left="3540" w:right="6377"/>
+        <w:rPr>
+          <w:rFonts w:ascii="Times New Roman" w:hAnsi="Times New Roman" w:cs="Times New Roman"/>
+          <w:sz w:val="20"/>
+          <w:szCs w:val="20"/>
+        </w:rPr>
+      </w:pPr>
+      <w:r>
+        <w:rPr>
+          <w:rFonts w:ascii="Times New Roman" w:hAnsi="Times New Roman" w:cs="Times New Roman"/>
+          <w:sz w:val="20"/>
+          <w:szCs w:val="20"/>
+        </w:rPr>
+        <w:t xml:space="preserve">            </w:t>
+      </w:r>
+      <w:r>
+        <w:rPr>
+          <w:rFonts w:ascii="Times New Roman" w:hAnsi="Times New Roman" w:cs="Times New Roman"/>
+          <w:sz w:val="20"/>
+          <w:szCs w:val="20"/>
+        </w:rPr>
+        <w:t xml:space="preserve">  </w:t>
+      </w:r>
+      <w:r>
+        <w:rPr>
+          <w:rFonts w:ascii="Times New Roman" w:hAnsi="Times New Roman" w:cs="Times New Roman"/>
+          <w:sz w:val="20"/>
+          <w:szCs w:val="20"/>
+        </w:rPr>
+        <w:t xml:space="preserve">  </w:t>
+      </w:r>
+      <w:r>
+        <w:rPr>
+          <w:rFonts w:ascii="Times New Roman" w:hAnsi="Times New Roman" w:cs="Times New Roman"/>
+          <w:sz w:val="20"/>
+          <w:szCs w:val="20"/>
+        </w:rPr>
+        <w:t xml:space="preserve">  </w:t>
+      </w:r>
+      <w:r>
+        <w:rPr>
+          <w:rFonts w:ascii="Times New Roman" w:hAnsi="Times New Roman" w:cs="Times New Roman"/>
+          <w:sz w:val="20"/>
+          <w:szCs w:val="20"/>
+        </w:rPr>
+        <w:t xml:space="preserve">            </w:t>
+      </w:r>
+    </w:p>
+    <w:p>
+      <w:pPr>
+        <w:pStyle w:val="Textebrut"/>
+        <w:ind w:right="6377"/>
+        <w:rPr>
+          <w:rFonts w:ascii="Times New Roman" w:hAnsi="Times New Roman" w:cs="Times New Roman"/>
+          <w:sz w:val="20"/>
+          <w:szCs w:val="20"/>
+        </w:rPr>
+      </w:pPr>
+      <w:r>
+        <w:rPr>
+          <w:rFonts w:ascii="Times New Roman" w:hAnsi="Times New Roman" w:cs="Times New Roman"/>
+          <w:sz w:val="20"/>
+          <w:szCs w:val="20"/>
+        </w:rPr>
+        <w:t xml:space="preserve">            </w:t>
+      </w:r>
+    </w:p>
+    <w:p>
+      <w:pPr>
+        <w:pStyle w:val="Textebrut"/>
+        <w:ind w:right="6377"/>
+        <w:rPr>
+          <w:rFonts w:ascii="Times New Roman" w:hAnsi="Times New Roman" w:cs="Times New Roman"/>
+          <w:b/>
+          <w:sz w:val="20"/>
+          <w:szCs w:val="20"/>
+        </w:rPr>
+      </w:pPr>
+      <w:r>
+        <w:rPr>
+          <w:rFonts w:ascii="Times New Roman" w:hAnsi="Times New Roman" w:cs="Times New Roman"/>
+          <w:sz w:val="20"/>
+          <w:szCs w:val="20"/>
+        </w:rPr>
         <w:t xml:space="preserve">      </w:t>
       </w:r>
     </w:p>
     <w:p/>
     <w:p/>
     <w:p/>
-    <w:p/>
-    <w:p/>
-    <w:p/>
     <w:p>
       <w:pPr>
         <w:tabs>
@@ -213,7 +210,6 @@
         <w:tab/>
       </w:r>
     </w:p>
-    <w:p/>
     <w:p>
       <w:pPr>
         <w:ind w:left="3540"/>
@@ -556,7 +552,23 @@
           <w:bCs/>
           <w:noProof/>
         </w:rPr>
-        <w:t>Classification</w:t>
+        <w:t>c</w:t>
+      </w:r>
+      <w:r>
+        <w:rPr>
+          <w:b/>
+          <w:bCs/>
+          <w:noProof/>
+        </w:rPr>
+        <w:t>lassification</w:t>
+      </w:r>
+      <w:r>
+        <w:rPr>
+          <w:b/>
+          <w:bCs/>
+          <w:noProof/>
+        </w:rPr>
+        <w:t>s</w:t>
       </w:r>
       <w:r>
         <w:rPr>
@@ -838,19 +850,34 @@
     </w:p>
     <w:p>
       <w:pPr>
+        <w:ind w:left="4248"/>
+        <w:rPr>
+          <w:b/>
+        </w:rPr>
+      </w:pPr>
+    </w:p>
+    <w:p>
+      <w:pPr>
+        <w:ind w:left="4248"/>
+        <w:rPr>
+          <w:b/>
+        </w:rPr>
+      </w:pPr>
+    </w:p>
+    <w:p>
+      <w:pPr>
+        <w:rPr>
+          <w:b/>
+        </w:rPr>
+      </w:pPr>
+    </w:p>
+    <w:p>
+      <w:pPr>
         <w:ind w:left="4956" w:firstLine="708"/>
         <w:rPr>
           <w:b/>
         </w:rPr>
       </w:pPr>
-    </w:p>
-    <w:p>
-      <w:pPr>
-        <w:ind w:left="4956" w:firstLine="708"/>
-        <w:rPr>
-          <w:b/>
-        </w:rPr>
-      </w:pPr>
       <w:r>
         <w:rPr>
           <w:b/>
@@ -883,14 +910,11 @@
     <w:p>
       <w:pPr>
         <w:ind w:left="6372"/>
-        <w:sectPr>
-          <w:footerReference w:type="default" r:id="rId8"/>
-          <w:pgSz w:w="11906" w:h="16838"/>
-          <w:pgMar w:top="142" w:right="2125" w:bottom="568" w:left="851" w:header="709" w:footer="513" w:gutter="0"/>
-          <w:pgNumType w:start="1"/>
-          <w:cols w:space="708"/>
-          <w:docGrid w:linePitch="360"/>
-        </w:sectPr>
+        <w:rPr>
+          <w:b/>
+          <w:bCs/>
+          <w:noProof/>
+        </w:rPr>
       </w:pPr>
       <w:r>
         <w:t xml:space="preserve">Site : </w:t>
@@ -901,114 +925,19 @@
           <w:bCs/>
           <w:noProof/>
         </w:rPr>
-        <w:t>Lieu de travail</w:t>
-      </w:r>
-    </w:p>
-    <w:p>
-      <w:pPr>
+        <w:t>Lieu de travai</w:t>
+      </w:r>
+      <w:r>
         <w:rPr>
           <w:b/>
           <w:bCs/>
-          <w:u w:val="single"/>
-        </w:rPr>
-      </w:pPr>
-      <w:r>
-        <w:rPr>
-          <w:b/>
-          <w:bCs/>
-          <w:noProof/>
-          <w:u w:val="single"/>
-        </w:rPr>
-        <w:drawing>
-          <wp:anchor distT="0" distB="0" distL="114300" distR="114300" simplePos="0" relativeHeight="251658240" behindDoc="1" locked="0" layoutInCell="1" allowOverlap="1" wp14:anchorId="4808DF56" wp14:editId="3F4CCEE5">
-            <wp:simplePos x="0" y="0"/>
-            <wp:positionH relativeFrom="rightMargin">
-              <wp:posOffset>66040</wp:posOffset>
-            </wp:positionH>
-            <wp:positionV relativeFrom="paragraph">
-              <wp:posOffset>272415</wp:posOffset>
-            </wp:positionV>
-            <wp:extent cx="1217930" cy="586740"/>
-            <wp:effectExtent l="0" t="0" r="1270" b="3810"/>
-            <wp:wrapNone/>
-            <wp:docPr id="3" name="Image 3"/>
-            <wp:cNvGraphicFramePr>
-              <a:graphicFrameLocks xmlns:a="http://schemas.openxmlformats.org/drawingml/2006/main" noChangeAspect="1"/>
-            </wp:cNvGraphicFramePr>
-            <a:graphic xmlns:a="http://schemas.openxmlformats.org/drawingml/2006/main">
-              <a:graphicData uri="http://schemas.openxmlformats.org/drawingml/2006/picture">
-                <pic:pic xmlns:pic="http://schemas.openxmlformats.org/drawingml/2006/picture">
-                  <pic:nvPicPr>
-                    <pic:cNvPr id="3" name="Image 3"/>
-                    <pic:cNvPicPr/>
-                  </pic:nvPicPr>
-                  <pic:blipFill rotWithShape="1">
-                    <a:blip r:embed="rId9" cstate="print">
-                      <a:extLst>
-                        <a:ext uri="{28A0092B-C50C-407E-A947-70E740481C1C}">
-                          <a14:useLocalDpi xmlns:a14="http://schemas.microsoft.com/office/drawing/2010/main" val="0"/>
-                        </a:ext>
-                      </a:extLst>
-                    </a:blip>
-                    <a:srcRect l="33458" t="34238" r="18456" b="49358"/>
-                    <a:stretch/>
-                  </pic:blipFill>
-                  <pic:spPr bwMode="auto">
-                    <a:xfrm>
-                      <a:off x="0" y="0"/>
-                      <a:ext cx="1217930" cy="586740"/>
-                    </a:xfrm>
-                    <a:prstGeom prst="rect">
-                      <a:avLst/>
-                    </a:prstGeom>
-                    <a:ln>
-                      <a:noFill/>
-                    </a:ln>
-                    <a:extLst>
-                      <a:ext uri="{53640926-AAD7-44D8-BBD7-CCE9431645EC}">
-                        <a14:shadowObscured xmlns:a14="http://schemas.microsoft.com/office/drawing/2010/main"/>
-                      </a:ext>
-                    </a:extLst>
-                  </pic:spPr>
-                </pic:pic>
-              </a:graphicData>
-            </a:graphic>
-            <wp14:sizeRelH relativeFrom="page">
-              <wp14:pctWidth>0</wp14:pctWidth>
-            </wp14:sizeRelH>
-            <wp14:sizeRelV relativeFrom="page">
-              <wp14:pctHeight>0</wp14:pctHeight>
-            </wp14:sizeRelV>
-          </wp:anchor>
-        </w:drawing>
-      </w:r>
-      <w:r>
-        <w:rPr>
-          <w:b/>
-          <w:bCs/>
-          <w:u w:val="single"/>
-        </w:rPr>
-        <w:fldChar w:fldCharType="begin"/>
-      </w:r>
-      <w:r>
-        <w:rPr>
-          <w:b/>
-          <w:bCs/>
-          <w:u w:val="single"/>
-        </w:rPr>
-        <w:instrText xml:space="preserve"> MERGEFIELD Si_Usage_Administrative </w:instrText>
-      </w:r>
-      <w:r>
-        <w:rPr>
-          <w:b/>
-          <w:bCs/>
-          <w:u w:val="single"/>
-        </w:rPr>
-        <w:fldChar w:fldCharType="end"/>
+          <w:noProof/>
+        </w:rPr>
+        <w:t>l</w:t>
       </w:r>
     </w:p>
     <w:sectPr>
-      <w:footerReference w:type="default" r:id="rId10"/>
+      <w:footerReference w:type="default" r:id="rId8"/>
       <w:type w:val="continuous"/>
       <w:pgSz w:w="11906" w:h="16838"/>
       <w:pgMar w:top="426" w:right="1416" w:bottom="568" w:left="851" w:header="709" w:footer="709" w:gutter="0"/>
@@ -1039,226 +968,6 @@
 </file>
 
 <file path=word/footer1.xml><?xml version="1.0" encoding="utf-8"?>
-<w:ftr xmlns:wpc="http://schemas.microsoft.com/office/word/2010/wordprocessingCanvas" xmlns:cx="http://schemas.microsoft.com/office/drawing/2014/chartex" xmlns:cx1="http://schemas.microsoft.com/office/drawing/2015/9/8/chartex" xmlns:cx2="http://schemas.microsoft.com/office/drawing/2015/10/21/chartex" xmlns:cx3="http://schemas.microsoft.com/office/drawing/2016/5/9/chartex" xmlns:cx4="http://schemas.microsoft.com/office/drawing/2016/5/10/chartex" xmlns:cx5="http://schemas.microsoft.com/office/drawing/2016/5/11/chartex" xmlns:cx6="http://schemas.microsoft.com/office/drawing/2016/5/12/chartex" xmlns:cx7="http://schemas.microsoft.com/office/drawing/2016/5/13/chartex" xmlns:cx8="http://schemas.microsoft.com/office/drawing/2016/5/14/chartex" xmlns:mc="http://schemas.openxmlformats.org/markup-compatibility/2006" xmlns:aink="http://schemas.microsoft.com/office/drawing/2016/ink" xmlns:am3d="http://schemas.microsoft.com/office/drawing/2017/model3d" xmlns:o="urn:schemas-microsoft-com:office:office" xmlns:oel="http://schemas.microsoft.com/office/2019/extlst" xmlns:r="http://schemas.openxmlformats.org/officeDocument/2006/relationships" xmlns:m="http://schemas.openxmlformats.org/officeDocument/2006/math" xmlns:v="urn:schemas-microsoft-com:vml" xmlns:wp14="http://schemas.microsoft.com/office/word/2010/wordprocessingDrawing" xmlns:wp="http://schemas.openxmlformats.org/drawingml/2006/wordprocessingDrawing" xmlns:w10="urn:schemas-microsoft-com:office:word" xmlns:w="http://schemas.openxmlformats.org/wordprocessingml/2006/main" xmlns:w14="http://schemas.microsoft.com/office/word/2010/wordml" xmlns:w15="http://schemas.microsoft.com/office/word/2012/wordml" xmlns:w16cex="http://schemas.microsoft.com/office/word/2018/wordml/cex" xmlns:w16cid="http://schemas.microsoft.com/office/word/2016/wordml/cid" xmlns:w16="http://schemas.microsoft.com/office/word/2018/wordml" xmlns:w16du="http://schemas.microsoft.com/office/word/2023/wordml/word16du" xmlns:w16sdtdh="http://schemas.microsoft.com/office/word/2020/wordml/sdtdatahash" xmlns:w16sdtfl="http://schemas.microsoft.com/office/word/2024/wordml/sdtformatlock" xmlns:w16se="http://schemas.microsoft.com/office/word/2015/wordml/symex" xmlns:wpg="http://schemas.microsoft.com/office/word/2010/wordprocessingGroup" xmlns:wpi="http://schemas.microsoft.com/office/word/2010/wordprocessingInk" xmlns:wne="http://schemas.microsoft.com/office/word/2006/wordml" xmlns:wps="http://schemas.microsoft.com/office/word/2010/wordprocessingShape" mc:Ignorable="w14 w15 w16se w16cid w16 w16cex w16sdtdh w16sdtfl w16du wp14">
-  <w:p>
-    <w:pPr>
-      <w:pStyle w:val="Pieddepage"/>
-      <w:jc w:val="both"/>
-      <w:rPr>
-        <w:sz w:val="20"/>
-        <w:szCs w:val="20"/>
-        <w:lang w:val="en-US"/>
-      </w:rPr>
-    </w:pPr>
-    <w:r>
-      <w:rPr>
-        <w:sz w:val="20"/>
-        <w:szCs w:val="20"/>
-        <w:lang w:val="en-US"/>
-      </w:rPr>
-      <w:t xml:space="preserve">Lot ITV 27 ter </w:t>
-    </w:r>
-    <w:proofErr w:type="spellStart"/>
-    <w:r>
-      <w:rPr>
-        <w:sz w:val="20"/>
-        <w:szCs w:val="20"/>
-        <w:lang w:val="en-US"/>
-      </w:rPr>
-      <w:t>Andrefantsena</w:t>
-    </w:r>
-    <w:proofErr w:type="spellEnd"/>
-    <w:r>
-      <w:rPr>
-        <w:sz w:val="20"/>
-        <w:szCs w:val="20"/>
-        <w:lang w:val="en-US"/>
-      </w:rPr>
-      <w:t xml:space="preserve"> </w:t>
-    </w:r>
-    <w:proofErr w:type="spellStart"/>
-    <w:r>
-      <w:rPr>
-        <w:sz w:val="20"/>
-        <w:szCs w:val="20"/>
-        <w:lang w:val="en-US"/>
-      </w:rPr>
-      <w:t>Itaosy</w:t>
-    </w:r>
-    <w:proofErr w:type="spellEnd"/>
-    <w:r>
-      <w:rPr>
-        <w:sz w:val="20"/>
-        <w:szCs w:val="20"/>
-        <w:lang w:val="en-US"/>
-      </w:rPr>
-      <w:t xml:space="preserve">- Antananarivo 102- </w:t>
-    </w:r>
-    <w:proofErr w:type="spellStart"/>
-    <w:r>
-      <w:rPr>
-        <w:sz w:val="20"/>
-        <w:szCs w:val="20"/>
-        <w:lang w:val="en-US"/>
-      </w:rPr>
-      <w:t>Andranonahoatra</w:t>
-    </w:r>
-    <w:proofErr w:type="spellEnd"/>
-    <w:r>
-      <w:rPr>
-        <w:sz w:val="20"/>
-        <w:szCs w:val="20"/>
-        <w:lang w:val="en-US"/>
-      </w:rPr>
-      <w:t xml:space="preserve"> – RCS: 2003 B 710 – </w:t>
-    </w:r>
-    <w:proofErr w:type="spellStart"/>
-    <w:r>
-      <w:rPr>
-        <w:sz w:val="20"/>
-        <w:szCs w:val="20"/>
-        <w:lang w:val="en-US"/>
-      </w:rPr>
-      <w:t>Numéro</w:t>
-    </w:r>
-    <w:proofErr w:type="spellEnd"/>
-    <w:r>
-      <w:rPr>
-        <w:sz w:val="20"/>
-        <w:szCs w:val="20"/>
-        <w:lang w:val="en-US"/>
-      </w:rPr>
-      <w:t xml:space="preserve"> </w:t>
-    </w:r>
-    <w:proofErr w:type="spellStart"/>
-    <w:r>
-      <w:rPr>
-        <w:sz w:val="20"/>
-        <w:szCs w:val="20"/>
-        <w:lang w:val="en-US"/>
-      </w:rPr>
-      <w:t>d’indentification</w:t>
-    </w:r>
-    <w:proofErr w:type="spellEnd"/>
-    <w:r>
-      <w:rPr>
-        <w:sz w:val="20"/>
-        <w:szCs w:val="20"/>
-        <w:lang w:val="en-US"/>
-      </w:rPr>
-      <w:t xml:space="preserve">: 46101 11 1990 010010 - </w:t>
-    </w:r>
-    <w:proofErr w:type="spellStart"/>
-    <w:r>
-      <w:rPr>
-        <w:sz w:val="20"/>
-        <w:szCs w:val="20"/>
-        <w:lang w:val="en-US"/>
-      </w:rPr>
-      <w:t>Numéro</w:t>
-    </w:r>
-    <w:proofErr w:type="spellEnd"/>
-    <w:r>
-      <w:rPr>
-        <w:sz w:val="20"/>
-        <w:szCs w:val="20"/>
-        <w:lang w:val="en-US"/>
-      </w:rPr>
-      <w:t xml:space="preserve"> </w:t>
-    </w:r>
-    <w:proofErr w:type="spellStart"/>
-    <w:r>
-      <w:rPr>
-        <w:sz w:val="20"/>
-        <w:szCs w:val="20"/>
-        <w:lang w:val="en-US"/>
-      </w:rPr>
-      <w:t>d’Identification</w:t>
-    </w:r>
-    <w:proofErr w:type="spellEnd"/>
-    <w:r>
-      <w:rPr>
-        <w:sz w:val="20"/>
-        <w:szCs w:val="20"/>
-        <w:lang w:val="en-US"/>
-      </w:rPr>
-      <w:t xml:space="preserve"> </w:t>
-    </w:r>
-    <w:proofErr w:type="gramStart"/>
-    <w:r>
-      <w:rPr>
-        <w:sz w:val="20"/>
-        <w:szCs w:val="20"/>
-        <w:lang w:val="en-US"/>
-      </w:rPr>
-      <w:t>Fiscal :</w:t>
-    </w:r>
-    <w:proofErr w:type="gramEnd"/>
-    <w:r>
-      <w:rPr>
-        <w:sz w:val="20"/>
-        <w:szCs w:val="20"/>
-        <w:lang w:val="en-US"/>
-      </w:rPr>
-      <w:t xml:space="preserve"> 5000056860- BP: </w:t>
-    </w:r>
-    <w:proofErr w:type="gramStart"/>
-    <w:r>
-      <w:rPr>
-        <w:sz w:val="20"/>
-        <w:szCs w:val="20"/>
-        <w:lang w:val="en-US"/>
-      </w:rPr>
-      <w:t>9022</w:t>
-    </w:r>
-    <w:r>
-      <w:rPr>
-        <w:sz w:val="20"/>
-        <w:szCs w:val="20"/>
-        <w:lang w:val="en-US"/>
-      </w:rPr>
-      <w:t xml:space="preserve">  -</w:t>
-    </w:r>
-    <w:proofErr w:type="gramEnd"/>
-    <w:r>
-      <w:rPr>
-        <w:sz w:val="20"/>
-        <w:szCs w:val="20"/>
-        <w:lang w:val="en-US"/>
-      </w:rPr>
-      <w:t xml:space="preserve">                             </w:t>
-    </w:r>
-    <w:r>
-      <w:rPr>
-        <w:i/>
-        <w:iCs/>
-        <w:sz w:val="16"/>
-        <w:szCs w:val="16"/>
-        <w:lang w:val="en-US"/>
-      </w:rPr>
-      <w:t>PBI_RH_ATT_V00_20240117</w:t>
-    </w:r>
-  </w:p>
-  <w:p>
-    <w:pPr>
-      <w:pStyle w:val="Pieddepage"/>
-      <w:tabs>
-        <w:tab w:val="clear" w:pos="4536"/>
-        <w:tab w:val="clear" w:pos="9072"/>
-        <w:tab w:val="center" w:pos="4819"/>
-        <w:tab w:val="right" w:pos="9639"/>
-      </w:tabs>
-      <w:rPr>
-        <w:sz w:val="20"/>
-        <w:szCs w:val="20"/>
-        <w:lang w:val="en-US"/>
-      </w:rPr>
-    </w:pPr>
-  </w:p>
-</w:ftr>
-</file>
-
-<file path=word/footer2.xml><?xml version="1.0" encoding="utf-8"?>
 <w:ftr xmlns:wpc="http://schemas.microsoft.com/office/word/2010/wordprocessingCanvas" xmlns:cx="http://schemas.microsoft.com/office/drawing/2014/chartex" xmlns:cx1="http://schemas.microsoft.com/office/drawing/2015/9/8/chartex" xmlns:cx2="http://schemas.microsoft.com/office/drawing/2015/10/21/chartex" xmlns:cx3="http://schemas.microsoft.com/office/drawing/2016/5/9/chartex" xmlns:cx4="http://schemas.microsoft.com/office/drawing/2016/5/10/chartex" xmlns:cx5="http://schemas.microsoft.com/office/drawing/2016/5/11/chartex" xmlns:cx6="http://schemas.microsoft.com/office/drawing/2016/5/12/chartex" xmlns:cx7="http://schemas.microsoft.com/office/drawing/2016/5/13/chartex" xmlns:cx8="http://schemas.microsoft.com/office/drawing/2016/5/14/chartex" xmlns:mc="http://schemas.openxmlformats.org/markup-compatibility/2006" xmlns:aink="http://schemas.microsoft.com/office/drawing/2016/ink" xmlns:am3d="http://schemas.microsoft.com/office/drawing/2017/model3d" xmlns:o="urn:schemas-microsoft-com:office:office" xmlns:oel="http://schemas.microsoft.com/office/2019/extlst" xmlns:r="http://schemas.openxmlformats.org/officeDocument/2006/relationships" xmlns:m="http://schemas.openxmlformats.org/officeDocument/2006/math" xmlns:v="urn:schemas-microsoft-com:vml" xmlns:wp14="http://schemas.microsoft.com/office/word/2010/wordprocessingDrawing" xmlns:wp="http://schemas.openxmlformats.org/drawingml/2006/wordprocessingDrawing" xmlns:w10="urn:schemas-microsoft-com:office:word" xmlns:w="http://schemas.openxmlformats.org/wordprocessingml/2006/main" xmlns:w14="http://schemas.microsoft.com/office/word/2010/wordml" xmlns:w15="http://schemas.microsoft.com/office/word/2012/wordml" xmlns:w16cex="http://schemas.microsoft.com/office/word/2018/wordml/cex" xmlns:w16cid="http://schemas.microsoft.com/office/word/2016/wordml/cid" xmlns:w16="http://schemas.microsoft.com/office/word/2018/wordml" xmlns:w16du="http://schemas.microsoft.com/office/word/2023/wordml/word16du" xmlns:w16sdtdh="http://schemas.microsoft.com/office/word/2020/wordml/sdtdatahash" xmlns:w16sdtfl="http://schemas.microsoft.com/office/word/2024/wordml/sdtformatlock" xmlns:w16se="http://schemas.microsoft.com/office/word/2015/wordml/symex" xmlns:wpg="http://schemas.microsoft.com/office/word/2010/wordprocessingGroup" xmlns:wpi="http://schemas.microsoft.com/office/word/2010/wordprocessingInk" xmlns:wne="http://schemas.microsoft.com/office/word/2006/wordml" xmlns:wps="http://schemas.microsoft.com/office/word/2010/wordprocessingShape" mc:Ignorable="w14 w15 w16se w16cid w16 w16cex w16sdtdh w16sdtfl w16du wp14">
   <w:p>
     <w:pPr>

</xml_diff>